<commit_message>
feat(edicion): edición final del Libro I con portada, dedicatoria y fondo
- Portada artística del autor como página 1 (tal cual).
- Dedicatoria personal (a Daniela y Dania) en el pliego inicial, en
  cursiva, sin folio.
- Fondo pergamino con mapas celestes bajo las 178 páginas; el libro se
  recompuso al tamaño exacto del fondo (396.75 x 663 pt).
- Herramientas versionadas (gen-libro.js + ensamblar_pdf.py) y archivos
  de diseño en fuente/diseno/ para reutilizar en los Libros II y III.

Co-Authored-By: Claude Fable 5 <noreply@anthropic.com>
Claude-Session: https://claude.ai/code/session_01EjRUkWLkdqp1ESEfUtr6Lx
</commit_message>
<xml_diff>
--- a/edicion-coleccionista/entregas/HIJOS_DEL_FIRMAMENTO_Libro_I.docx
+++ b/edicion-coleccionista/entregas/HIJOS_DEL_FIRMAMENTO_Libro_I.docx
@@ -159,6 +159,241 @@
     </w:p>
     <w:p>
       <w:pPr>
+        <w:spacing w:after="0" w:before="600"/>
+      </w:pPr>
+    </w:p>
+    <w:p>
+      <w:pPr>
+        <w:spacing w:after="300" w:before="260" w:line="300" w:lineRule="auto"/>
+        <w:jc w:val="center"/>
+      </w:pPr>
+      <w:r>
+        <w:rPr>
+          <w:rFonts w:ascii="Garamond" w:cs="Garamond" w:eastAsia="Garamond" w:hAnsi="Garamond"/>
+          <w:sz w:val="20"/>
+          <w:szCs w:val="20"/>
+        </w:rPr>
+        <w:t xml:space="preserve">✦</w:t>
+      </w:r>
+    </w:p>
+    <w:p>
+      <w:pPr>
+        <w:spacing w:after="160" w:before="260" w:line="300" w:lineRule="auto"/>
+        <w:jc w:val="center"/>
+      </w:pPr>
+      <w:r>
+        <w:rPr>
+          <w:rFonts w:ascii="Garamond" w:cs="Garamond" w:eastAsia="Garamond" w:hAnsi="Garamond"/>
+          <w:i/>
+          <w:iCs/>
+          <w:sz w:val="22"/>
+          <w:szCs w:val="22"/>
+        </w:rPr>
+        <w:t xml:space="preserve">A Daniela, mi compañera de vida.</w:t>
+      </w:r>
+    </w:p>
+    <w:p>
+      <w:pPr>
+        <w:spacing w:after="0" w:before="160" w:line="300" w:lineRule="auto"/>
+        <w:ind w:left="280" w:right="280"/>
+        <w:jc w:val="both"/>
+      </w:pPr>
+      <w:r>
+        <w:rPr>
+          <w:rFonts w:ascii="Garamond" w:cs="Garamond" w:eastAsia="Garamond" w:hAnsi="Garamond"/>
+          <w:i/>
+          <w:iCs/>
+          <w:sz w:val="22"/>
+          <w:szCs w:val="22"/>
+        </w:rPr>
+        <w:t xml:space="preserve">Gracias por caminar a mi lado cuando el sendero fue claro y también cuando la niebla parecía esconder el horizonte. Gracias por creer en mí incluso en los días en que yo olvidaba cómo hacerlo. En cada una de estas páginas hay noches que me regalaste, silencios que respetaste, sueños que protegiste y un amor que hizo posible que esta historia existiera.</w:t>
+      </w:r>
+    </w:p>
+    <w:p>
+      <w:pPr>
+        <w:spacing w:after="160" w:before="260" w:line="300" w:lineRule="auto"/>
+        <w:jc w:val="center"/>
+      </w:pPr>
+      <w:r>
+        <w:rPr>
+          <w:rFonts w:ascii="Garamond" w:cs="Garamond" w:eastAsia="Garamond" w:hAnsi="Garamond"/>
+          <w:i/>
+          <w:iCs/>
+          <w:sz w:val="22"/>
+          <w:szCs w:val="22"/>
+        </w:rPr>
+        <w:t xml:space="preserve">Y a Dania, mi pequeña estrella.</w:t>
+      </w:r>
+    </w:p>
+    <w:p>
+      <w:pPr>
+        <w:spacing w:after="0" w:before="160" w:line="300" w:lineRule="auto"/>
+        <w:ind w:left="280" w:right="280"/>
+        <w:jc w:val="both"/>
+      </w:pPr>
+      <w:r>
+        <w:rPr>
+          <w:rFonts w:ascii="Garamond" w:cs="Garamond" w:eastAsia="Garamond" w:hAnsi="Garamond"/>
+          <w:i/>
+          <w:iCs/>
+          <w:sz w:val="22"/>
+          <w:szCs w:val="22"/>
+        </w:rPr>
+        <w:t xml:space="preserve">Llegaste para enseñarme que el universo más inmenso no está sobre nuestras cabezas, sino entre los brazos de un padre y la sonrisa de una hija. Desde que naciste comprendí que todas las constelaciones del cielo son apenas un reflejo de la luz que llevas dentro. Si algún día lees estas páginas, quiero que sepas que fueron escritas pensando en el mundo que deseo dejarte: uno donde nunca dejes de hacer preguntas, donde la curiosidad sea más fuerte que el miedo y donde tu corazón siempre encuentre el camino hacia la verdad.</w:t>
+      </w:r>
+    </w:p>
+    <w:p>
+      <w:pPr>
+        <w:spacing w:after="0" w:before="160" w:line="300" w:lineRule="auto"/>
+        <w:ind w:left="280" w:right="280"/>
+        <w:jc w:val="both"/>
+      </w:pPr>
+      <w:r>
+        <w:rPr>
+          <w:rFonts w:ascii="Garamond" w:cs="Garamond" w:eastAsia="Garamond" w:hAnsi="Garamond"/>
+          <w:i/>
+          <w:iCs/>
+          <w:sz w:val="22"/>
+          <w:szCs w:val="22"/>
+        </w:rPr>
+        <w:t xml:space="preserve">Este libro habla de héroes, de dioses, de estrellas y de hombres que buscaron comprender el firmamento. Pero la verdad es que los dos mayores milagros de mi vida nunca estuvieron en el cielo.</w:t>
+      </w:r>
+    </w:p>
+    <w:p>
+      <w:pPr>
+        <w:spacing w:after="160" w:before="260" w:line="300" w:lineRule="auto"/>
+        <w:jc w:val="center"/>
+      </w:pPr>
+      <w:r>
+        <w:rPr>
+          <w:rFonts w:ascii="Garamond" w:cs="Garamond" w:eastAsia="Garamond" w:hAnsi="Garamond"/>
+          <w:i/>
+          <w:iCs/>
+          <w:sz w:val="22"/>
+          <w:szCs w:val="22"/>
+        </w:rPr>
+        <w:t xml:space="preserve">Siempre estuvieron esperándome en casa.</w:t>
+      </w:r>
+    </w:p>
+    <w:p>
+      <w:pPr>
+        <w:spacing w:after="0" w:before="160" w:line="300" w:lineRule="auto"/>
+        <w:ind w:left="280" w:right="280"/>
+        <w:jc w:val="both"/>
+      </w:pPr>
+      <w:r>
+        <w:rPr>
+          <w:rFonts w:ascii="Garamond" w:cs="Garamond" w:eastAsia="Garamond" w:hAnsi="Garamond"/>
+          <w:i/>
+          <w:iCs/>
+          <w:sz w:val="22"/>
+          <w:szCs w:val="22"/>
+        </w:rPr>
+        <w:t xml:space="preserve">Porque entendí que no hay gloria más grande que regresar al lugar donde ustedes están; no hay conquista comparable con escuchar sus voces; no hay eternidad más hermosa que el tiempo compartido a su lado.</w:t>
+      </w:r>
+    </w:p>
+    <w:p>
+      <w:pPr>
+        <w:spacing w:after="0" w:before="160" w:line="300" w:lineRule="auto"/>
+        <w:ind w:left="280" w:right="280"/>
+        <w:jc w:val="both"/>
+      </w:pPr>
+      <w:r>
+        <w:rPr>
+          <w:rFonts w:ascii="Garamond" w:cs="Garamond" w:eastAsia="Garamond" w:hAnsi="Garamond"/>
+          <w:i/>
+          <w:iCs/>
+          <w:sz w:val="22"/>
+          <w:szCs w:val="22"/>
+        </w:rPr>
+        <w:t xml:space="preserve">Si alguna vez este libro encuentra un lugar en las manos de otros lectores, deseo que sepan que antes de pertenecerles a ellos, siempre les perteneció a ustedes.</w:t>
+      </w:r>
+    </w:p>
+    <w:p>
+      <w:pPr>
+        <w:spacing w:after="160" w:before="260" w:line="300" w:lineRule="auto"/>
+        <w:jc w:val="center"/>
+      </w:pPr>
+      <w:r>
+        <w:rPr>
+          <w:rFonts w:ascii="Garamond" w:cs="Garamond" w:eastAsia="Garamond" w:hAnsi="Garamond"/>
+          <w:i/>
+          <w:iCs/>
+          <w:sz w:val="22"/>
+          <w:szCs w:val="22"/>
+        </w:rPr>
+        <w:t xml:space="preserve">Cada palabra nació de mi amor por ustedes.</w:t>
+      </w:r>
+    </w:p>
+    <w:p>
+      <w:pPr>
+        <w:spacing w:after="160" w:before="260" w:line="300" w:lineRule="auto"/>
+        <w:jc w:val="center"/>
+      </w:pPr>
+      <w:r>
+        <w:rPr>
+          <w:rFonts w:ascii="Garamond" w:cs="Garamond" w:eastAsia="Garamond" w:hAnsi="Garamond"/>
+          <w:i/>
+          <w:iCs/>
+          <w:sz w:val="22"/>
+          <w:szCs w:val="22"/>
+        </w:rPr>
+        <w:t xml:space="preserve">Cada página fue escrita pensando en ustedes.</w:t>
+      </w:r>
+    </w:p>
+    <w:p>
+      <w:pPr>
+        <w:spacing w:after="160" w:before="260" w:line="300" w:lineRule="auto"/>
+        <w:jc w:val="center"/>
+      </w:pPr>
+      <w:r>
+        <w:rPr>
+          <w:rFonts w:ascii="Garamond" w:cs="Garamond" w:eastAsia="Garamond" w:hAnsi="Garamond"/>
+          <w:i/>
+          <w:iCs/>
+          <w:sz w:val="22"/>
+          <w:szCs w:val="22"/>
+        </w:rPr>
+        <w:t xml:space="preserve">Cada sueño que este libro alcance será, para siempre, de ustedes.</w:t>
+      </w:r>
+    </w:p>
+    <w:p>
+      <w:pPr>
+        <w:spacing w:after="160" w:before="260" w:line="300" w:lineRule="auto"/>
+        <w:jc w:val="center"/>
+      </w:pPr>
+      <w:r>
+        <w:rPr>
+          <w:rFonts w:ascii="Garamond" w:cs="Garamond" w:eastAsia="Garamond" w:hAnsi="Garamond"/>
+          <w:i/>
+          <w:iCs/>
+          <w:sz w:val="22"/>
+          <w:szCs w:val="22"/>
+        </w:rPr>
+        <w:t xml:space="preserve">Con todo mi amor, hoy y siempre.</w:t>
+      </w:r>
+    </w:p>
+    <w:p>
+      <w:pPr>
+        <w:spacing w:after="260" w:before="300" w:line="300" w:lineRule="auto"/>
+        <w:jc w:val="center"/>
+      </w:pPr>
+      <w:r>
+        <w:rPr>
+          <w:rFonts w:ascii="Garamond" w:cs="Garamond" w:eastAsia="Garamond" w:hAnsi="Garamond"/>
+          <w:sz w:val="20"/>
+          <w:szCs w:val="20"/>
+        </w:rPr>
+        <w:t xml:space="preserve">✦</w:t>
+      </w:r>
+    </w:p>
+    <w:p>
+      <w:r>
+        <w:br w:type="page"/>
+      </w:r>
+    </w:p>
+    <w:p>
+      <w:pPr>
         <w:spacing w:after="0" w:before="2400"/>
       </w:pPr>
     </w:p>
@@ -218,8 +453,8 @@
       <w:pPr>
         <w:sectPr>
           <w:footerReference w:type="default" r:id="rId7"/>
-          <w:pgSz w:w="7920" w:h="12240" w:orient="portrait"/>
-          <w:pgMar w:top="1300" w:right="1250" w:bottom="1200" w:left="1250" w:header="708" w:footer="708" w:gutter="0"/>
+          <w:pgSz w:w="7935" w:h="13260" w:orient="portrait"/>
+          <w:pgMar w:top="1550" w:right="1280" w:bottom="1350" w:left="1280" w:header="708" w:footer="708" w:gutter="0"/>
           <w:pgNumType/>
           <w:docGrid w:linePitch="360"/>
         </w:sectPr>
@@ -31838,8 +32073,8 @@
     <w:sectPr>
       <w:footerReference w:type="default" r:id="rId8"/>
       <w:type w:val="nextPage"/>
-      <w:pgSz w:w="7920" w:h="12240" w:orient="portrait"/>
-      <w:pgMar w:top="1300" w:right="1250" w:bottom="1200" w:left="1250" w:header="708" w:footer="708" w:gutter="0"/>
+      <w:pgSz w:w="7935" w:h="13260" w:orient="portrait"/>
+      <w:pgMar w:top="1550" w:right="1280" w:bottom="1350" w:left="1280" w:header="708" w:footer="708" w:gutter="0"/>
       <w:pgNumType w:start="1"/>
       <w:docGrid w:linePitch="360"/>
     </w:sectPr>

</xml_diff>